<commit_message>
Ajustes TCE DOCX, formulário e Firebase; prefer-const em tceDocxService.
Made-with: Cursor
</commit_message>
<xml_diff>
--- a/public/templates/tce.docx
+++ b/public/templates/tce.docx
@@ -579,7 +579,15 @@
           <w:sz w:val="16"/>
           <w:szCs w:val="16"/>
         </w:rPr>
-        <w:t xml:space="preserve">    Estado: {empresa_uf}    </w:t>
+        <w:t xml:space="preserve">Estado: {empresa_uf} </w:t>
+      </w:r>
+      <w:r>
+        <w:rPr>
+          <w:rFonts w:ascii="Arial" w:hAnsi="Arial" w:cs="Arial"/>
+          <w:sz w:val="16"/>
+          <w:szCs w:val="16"/>
+        </w:rPr>
+        <w:t xml:space="preserve">   </w:t>
       </w:r>
       <w:r>
         <w:rPr>
@@ -669,15 +677,7 @@
           <w:sz w:val="16"/>
           <w:szCs w:val="16"/>
         </w:rPr>
-        <w:t>Telefone:</w:t>
-      </w:r>
-      <w:r w:rsidR="00TEL01">
-        <w:rPr>
-          <w:rFonts w:ascii="Arial" w:hAnsi="Arial" w:cs="Arial"/>
-          <w:sz w:val="16"/>
-          <w:szCs w:val="16"/>
-        </w:rPr>
-        <w:t xml:space="preserve"> {empresa_telefone}</w:t>
+        <w:t xml:space="preserve">Telefone: </w:t>
       </w:r>
     </w:p>
     <w:p>
@@ -743,15 +743,7 @@
           <w:sz w:val="16"/>
           <w:szCs w:val="16"/>
         </w:rPr>
-        <w:t>Cargo:</w:t>
-      </w:r>
-      <w:r w:rsidR="00CARG1">
-        <w:rPr>
-          <w:rFonts w:ascii="Arial" w:hAnsi="Arial" w:cs="Arial"/>
-          <w:sz w:val="16"/>
-          <w:szCs w:val="16"/>
-        </w:rPr>
-        <w:t xml:space="preserve"> {empresa_cargo}</w:t>
+        <w:t xml:space="preserve">Cargo: </w:t>
       </w:r>
     </w:p>
     <w:p>
@@ -764,7 +756,8 @@
           <w:right w:val="single" w:sz="12" w:space="0" w:color="000080"/>
         </w:pBdr>
         <w:tabs>
-          <w:tab w:val="right" w:pos="9072"/>
+          <w:tab w:val="left" w:pos="2940"/>
+          <w:tab w:val="left" w:pos="4365"/>
         </w:tabs>
         <w:spacing w:line="200" w:lineRule="exact"/>
         <w:jc w:val="both"/>
@@ -809,16 +802,7 @@
           <w:sz w:val="16"/>
           <w:szCs w:val="16"/>
         </w:rPr>
-        <w:tab/>
-      </w:r>
-      <w:r>
-        <w:rPr>
-          <w:rFonts w:ascii="Arial" w:hAnsi="Arial" w:cs="Arial"/>
-          <w:b/>
-          <w:sz w:val="16"/>
-          <w:szCs w:val="16"/>
-        </w:rPr>
-        <w:t xml:space="preserve">CNPJ: {ie_cnpj}</w:t>
+        <w:t xml:space="preserve">                                                                                                                     CNPJ: {ie_cnpj} </w:t>
       </w:r>
     </w:p>
     <w:p>
@@ -956,6 +940,14 @@
       <w:r>
         <w:rPr>
           <w:rFonts w:ascii="Arial" w:hAnsi="Arial" w:cs="Arial"/>
+          <w:sz w:val="16"/>
+          <w:szCs w:val="16"/>
+        </w:rPr>
+        <w:br w:type="textWrapping"/>
+      </w:r>
+      <w:r>
+        <w:rPr>
+          <w:rFonts w:ascii="Arial" w:hAnsi="Arial" w:cs="Arial"/>
           <w:b/>
           <w:sz w:val="16"/>
           <w:szCs w:val="16"/>
@@ -971,18 +963,40 @@
         <w:t xml:space="preserve"> {ie_reitor}</w:t>
       </w:r>
     </w:p>
-    <w:p w14:paraId="00CARIMBO" w14:textId="71CARIMBO">
+    <w:p>
       <w:pPr>
         <w:pStyle w:val="Corpodetexto"/>
-        <w:spacing w:before="0" w:after="0" w:line="80" w:lineRule="exact"/>
-        <w:jc w:val="center"/>
-      </w:pPr>
-      <w:r>
-        <w:rPr>
-          <w:rFonts w:ascii="Arial" w:hAnsi="Arial" w:cs="Arial"/>
-          <w:sz w:val="16"/>
-        </w:rPr>
-        <w:t xml:space="preserve"> </w:t>
+        <w:pBdr>
+          <w:top w:val="single" w:sz="12" w:space="1" w:color="333399"/>
+          <w:left w:val="single" w:sz="12" w:space="0" w:color="333399"/>
+          <w:bottom w:val="single" w:sz="12" w:space="1" w:color="333399"/>
+          <w:right w:val="single" w:sz="12" w:space="0" w:color="333399"/>
+        </w:pBdr>
+        <w:spacing w:before="80" w:line="200" w:lineRule="exact"/>
+        <w:rPr>
+          <w:rFonts w:ascii="Arial" w:hAnsi="Arial" w:cs="Arial"/>
+          <w:b/>
+          <w:sz w:val="16"/>
+          <w:szCs w:val="16"/>
+        </w:rPr>
+      </w:pPr>
+      <w:r>
+        <w:rPr>
+          <w:rFonts w:ascii="Arial" w:hAnsi="Arial" w:cs="Arial"/>
+          <w:b/>
+          <w:sz w:val="16"/>
+          <w:szCs w:val="16"/>
+        </w:rPr>
+        <w:t>Estudante:</w:t>
+      </w:r>
+      <w:r>
+        <w:rPr>
+          <w:rFonts w:ascii="Arial" w:hAnsi="Arial" w:cs="Arial"/>
+          <w:b/>
+          <w:sz w:val="16"/>
+          <w:szCs w:val="16"/>
+        </w:rPr>
+        <w:t xml:space="preserve"> {est_nome}</w:t>
       </w:r>
     </w:p>
     <w:p>
@@ -997,47 +1011,6 @@
         <w:spacing w:line="200" w:lineRule="exact"/>
         <w:rPr>
           <w:rFonts w:ascii="Arial" w:hAnsi="Arial" w:cs="Arial"/>
-          <w:b/>
-          <w:sz w:val="16"/>
-          <w:szCs w:val="16"/>
-        </w:rPr>
-      </w:pPr>
-      <w:r>
-        <w:rPr>
-          <w:rFonts w:ascii="Arial" w:hAnsi="Arial" w:cs="Arial"/>
-          <w:b/>
-          <w:sz w:val="16"/>
-          <w:szCs w:val="16"/>
-        </w:rPr>
-        <w:t>Estudante:</w:t>
-      </w:r>
-      <w:r>
-        <w:rPr>
-          <w:rFonts w:ascii="Arial" w:hAnsi="Arial" w:cs="Arial"/>
-          <w:b/>
-          <w:sz w:val="16"/>
-          <w:szCs w:val="16"/>
-        </w:rPr>
-        <w:t xml:space="preserve"> {est_nome}</w:t>
-      </w:r>
-    </w:p>
-    <w:p>
-      <w:pPr>
-        <w:pStyle w:val="Corpodetexto"/>
-        <w:pBdr>
-          <w:top w:val="single" w:sz="12" w:space="1" w:color="333399"/>
-          <w:left w:val="single" w:sz="12" w:space="0" w:color="333399"/>
-          <w:bottom w:val="single" w:sz="12" w:space="1" w:color="333399"/>
-          <w:right w:val="single" w:sz="12" w:space="0" w:color="333399"/>
-        </w:pBdr>
-        <w:tabs>
-          <w:tab w:val="left" w:pos="2160"/>
-          <w:tab w:val="left" w:pos="4320"/>
-          <w:tab w:val="left" w:pos="6480"/>
-        </w:tabs>
-        <w:spacing w:line="200" w:lineRule="exact"/>
-        <w:rPr>
-          <w:rFonts w:ascii="Arial" w:hAnsi="Arial" w:cs="Arial"/>
           <w:sz w:val="16"/>
           <w:szCs w:val="16"/>
         </w:rPr>
@@ -1072,6 +1045,38 @@
           <w:sz w:val="16"/>
           <w:szCs w:val="16"/>
         </w:rPr>
+        <w:t xml:space="preserve">                                   </w:t>
+      </w:r>
+      <w:r>
+        <w:rPr>
+          <w:rFonts w:ascii="Arial" w:hAnsi="Arial" w:cs="Arial"/>
+          <w:sz w:val="16"/>
+          <w:szCs w:val="16"/>
+        </w:rPr>
+        <w:t xml:space="preserve"> {est_row_spacer_17}</w:t>
+      </w:r>
+      <w:r>
+        <w:rPr>
+          <w:rFonts w:ascii="Arial" w:hAnsi="Arial" w:cs="Arial"/>
+          <w:sz w:val="16"/>
+          <w:szCs w:val="16"/>
+        </w:rPr>
+        <w:t>CPF</w:t>
+      </w:r>
+      <w:r>
+        <w:rPr>
+          <w:rFonts w:ascii="Arial" w:hAnsi="Arial" w:cs="Arial"/>
+          <w:sz w:val="16"/>
+          <w:szCs w:val="16"/>
+        </w:rPr>
+        <w:t xml:space="preserve">:    </w:t>
+      </w:r>
+      <w:r>
+        <w:rPr>
+          <w:rFonts w:ascii="Arial" w:hAnsi="Arial" w:cs="Arial"/>
+          <w:sz w:val="16"/>
+          <w:szCs w:val="16"/>
+        </w:rPr>
         <w:tab/>
       </w:r>
       <w:r>
@@ -1080,31 +1085,31 @@
           <w:sz w:val="16"/>
           <w:szCs w:val="16"/>
         </w:rPr>
-        <w:t>CPF</w:t>
-      </w:r>
-      <w:r>
-        <w:rPr>
-          <w:rFonts w:ascii="Arial" w:hAnsi="Arial" w:cs="Arial"/>
-          <w:sz w:val="16"/>
-          <w:szCs w:val="16"/>
-        </w:rPr>
-        <w:t xml:space="preserve">: </w:t>
-      </w:r>
-      <w:r>
-        <w:rPr>
-          <w:rFonts w:ascii="Arial" w:hAnsi="Arial" w:cs="Arial"/>
-          <w:sz w:val="16"/>
-          <w:szCs w:val="16"/>
-        </w:rPr>
-        <w:t xml:space="preserve"> {est_cpf}</w:t>
-      </w:r>
-      <w:r>
-        <w:rPr>
-          <w:rFonts w:ascii="Arial" w:hAnsi="Arial" w:cs="Arial"/>
-          <w:sz w:val="16"/>
-          <w:szCs w:val="16"/>
-        </w:rPr>
-        <w:tab/>
+        <w:t xml:space="preserve"> {est_row_spacer_18}</w:t>
+      </w:r>
+      <w:r>
+        <w:rPr>
+          <w:rFonts w:ascii="Arial" w:hAnsi="Arial" w:cs="Arial"/>
+          <w:sz w:val="16"/>
+          <w:szCs w:val="16"/>
+        </w:rPr>
+        <w:t xml:space="preserve">  </w:t>
+      </w:r>
+      <w:r>
+        <w:rPr>
+          <w:rFonts w:ascii="Arial" w:hAnsi="Arial" w:cs="Arial"/>
+          <w:sz w:val="16"/>
+          <w:szCs w:val="16"/>
+        </w:rPr>
+        <w:t xml:space="preserve">          </w:t>
+      </w:r>
+      <w:r>
+        <w:rPr>
+          <w:rFonts w:ascii="Arial" w:hAnsi="Arial" w:cs="Arial"/>
+          <w:sz w:val="16"/>
+          <w:szCs w:val="16"/>
+        </w:rPr>
+        <w:t xml:space="preserve">           </w:t>
       </w:r>
       <w:r>
         <w:rPr>
@@ -1136,7 +1141,39 @@
           <w:sz w:val="16"/>
           <w:szCs w:val="16"/>
         </w:rPr>
-        <w:tab/>
+        <w:t xml:space="preserve">  </w:t>
+      </w:r>
+      <w:r>
+        <w:rPr>
+          <w:rFonts w:ascii="Arial" w:hAnsi="Arial" w:cs="Arial"/>
+          <w:sz w:val="16"/>
+          <w:szCs w:val="16"/>
+        </w:rPr>
+        <w:t xml:space="preserve">           </w:t>
+      </w:r>
+      <w:r>
+        <w:rPr>
+          <w:rFonts w:ascii="Arial" w:hAnsi="Arial" w:cs="Arial"/>
+          <w:sz w:val="16"/>
+          <w:szCs w:val="16"/>
+        </w:rPr>
+        <w:t xml:space="preserve">    </w:t>
+      </w:r>
+      <w:r>
+        <w:rPr>
+          <w:rFonts w:ascii="Arial" w:hAnsi="Arial" w:cs="Arial"/>
+          <w:sz w:val="16"/>
+          <w:szCs w:val="16"/>
+        </w:rPr>
+        <w:t xml:space="preserve">    </w:t>
+      </w:r>
+      <w:r>
+        <w:rPr>
+          <w:rFonts w:ascii="Arial" w:hAnsi="Arial" w:cs="Arial"/>
+          <w:sz w:val="16"/>
+          <w:szCs w:val="16"/>
+        </w:rPr>
+        <w:t xml:space="preserve">   </w:t>
       </w:r>
       <w:r>
         <w:rPr>
@@ -1152,15 +1189,7 @@
           <w:sz w:val="16"/>
           <w:szCs w:val="16"/>
         </w:rPr>
-        <w:t>:</w:t>
-      </w:r>
-      <w:r w:rsidR="00NAC01">
-        <w:rPr>
-          <w:rFonts w:ascii="Arial" w:hAnsi="Arial" w:cs="Arial"/>
-          <w:sz w:val="16"/>
-          <w:szCs w:val="16"/>
-        </w:rPr>
-        <w:t xml:space="preserve"> {est_nacionalidade}</w:t>
+        <w:t xml:space="preserve">:  </w:t>
       </w:r>
     </w:p>
     <w:p>
@@ -1313,7 +1342,7 @@
           <w:sz w:val="16"/>
           <w:szCs w:val="16"/>
         </w:rPr>
-        <w:t>Telefone do responsável</w:t>
+        <w:t>RG</w:t>
       </w:r>
       <w:r>
         <w:rPr>
@@ -1329,7 +1358,7 @@
           <w:sz w:val="16"/>
           <w:szCs w:val="16"/>
         </w:rPr>
-        <w:t xml:space="preserve"> {resp_telefone_contrato}</w:t>
+        <w:t xml:space="preserve"> {est_rg}</w:t>
       </w:r>
       <w:r>
         <w:rPr>
@@ -1393,7 +1422,7 @@
           <w:sz w:val="16"/>
           <w:szCs w:val="16"/>
         </w:rPr>
-        <w:t xml:space="preserve"> {resp_cpf_contrato}</w:t>
+        <w:t xml:space="preserve"> {est_cpf}</w:t>
       </w:r>
     </w:p>
     <w:p>
@@ -1725,7 +1754,7 @@
     </w:p>
     <w:p>
       <w:pPr>
-        <w:spacing w:before="0" w:after="0" w:line="200" w:lineRule="exact"/>
+        <w:spacing w:before="0" w:after="100" w:line="180" w:lineRule="exact"/>
         <w:rPr>
           <w:rFonts w:ascii="Arial" w:hAnsi="Arial" w:cs="Arial"/>
           <w:b/>
@@ -1745,421 +1774,403 @@
     </w:p>
     <w:p>
       <w:pPr>
+        <w:spacing w:before="0" w:after="100" w:line="180" w:lineRule="exact"/>
+        <w:rPr>
+          <w:rFonts w:ascii="Arial" w:hAnsi="Arial" w:cs="Arial"/>
+          <w:b/>
+          <w:sz w:val="16"/>
+          <w:szCs w:val="16"/>
+        </w:rPr>
+      </w:pPr>
+      <w:r>
+        <w:rPr>
+          <w:rFonts w:ascii="Arial" w:hAnsi="Arial" w:cs="Arial"/>
+          <w:b/>
+          <w:sz w:val="16"/>
+          <w:szCs w:val="16"/>
+        </w:rPr>
+        <w:t>Período de realização de estágio</w:t>
+      </w:r>
+      <w:r>
+        <w:rPr>
+          <w:rFonts w:ascii="Arial" w:hAnsi="Arial" w:cs="Arial"/>
+          <w:b/>
+          <w:sz w:val="16"/>
+          <w:szCs w:val="16"/>
+        </w:rPr>
+        <w:t>:</w:t>
+      </w:r>
+      <w:r>
+        <w:rPr>
+          <w:rFonts w:ascii="Arial" w:hAnsi="Arial" w:cs="Arial"/>
+          <w:b/>
+          <w:sz w:val="16"/>
+          <w:szCs w:val="16"/>
+        </w:rPr>
+        <w:t xml:space="preserve"> {estagio_periodo}</w:t>
+      </w:r>
+    </w:p>
+    <w:p>
+      <w:pPr>
+        <w:spacing w:before="0" w:after="100" w:line="180" w:lineRule="exact"/>
+        <w:rPr>
+          <w:rFonts w:ascii="Arial" w:hAnsi="Arial" w:cs="Arial"/>
+          <w:b/>
+          <w:sz w:val="16"/>
+          <w:szCs w:val="16"/>
+        </w:rPr>
+      </w:pPr>
+      <w:r>
+        <w:rPr>
+          <w:rFonts w:ascii="Arial" w:hAnsi="Arial" w:cs="Arial"/>
+          <w:b/>
+          <w:sz w:val="16"/>
+          <w:szCs w:val="16"/>
+        </w:rPr>
+        <w:t>Horário de Estágio</w:t>
+      </w:r>
+      <w:r>
+        <w:rPr>
+          <w:rFonts w:ascii="Arial" w:hAnsi="Arial" w:cs="Arial"/>
+          <w:b/>
+          <w:sz w:val="16"/>
+          <w:szCs w:val="16"/>
+        </w:rPr>
+        <w:t xml:space="preserve">: </w:t>
+      </w:r>
+    </w:p>
+    <w:p>
+      <w:pPr>
+        <w:spacing w:before="0" w:after="100" w:line="180" w:lineRule="exact"/>
+        <w:rPr>
+          <w:rFonts w:ascii="Arial" w:hAnsi="Arial" w:cs="Arial"/>
+          <w:b/>
+          <w:sz w:val="16"/>
+          <w:szCs w:val="16"/>
+        </w:rPr>
+      </w:pPr>
+      <w:r>
+        <w:rPr>
+          <w:rFonts w:ascii="Arial" w:hAnsi="Arial" w:cs="Arial"/>
+          <w:b/>
+          <w:sz w:val="16"/>
+          <w:szCs w:val="16"/>
+        </w:rPr>
+        <w:t>Total semanal:</w:t>
+      </w:r>
+      <w:r>
+        <w:rPr>
+          <w:rFonts w:ascii="Arial" w:hAnsi="Arial" w:cs="Arial"/>
+          <w:b/>
+          <w:sz w:val="16"/>
+          <w:szCs w:val="16"/>
+        </w:rPr>
+        <w:t xml:space="preserve"> 30 horas </w:t>
+      </w:r>
+    </w:p>
+    <w:p>
+      <w:pPr>
+        <w:spacing w:before="0" w:after="100" w:line="180" w:lineRule="exact"/>
+        <w:rPr>
+          <w:rFonts w:ascii="Arial" w:hAnsi="Arial" w:cs="Arial"/>
+          <w:b/>
+          <w:sz w:val="16"/>
+          <w:szCs w:val="16"/>
+        </w:rPr>
+      </w:pPr>
+      <w:r>
+        <w:rPr>
+          <w:rFonts w:ascii="Arial" w:hAnsi="Arial" w:cs="Arial"/>
+          <w:b/>
+          <w:sz w:val="16"/>
+          <w:szCs w:val="16"/>
+        </w:rPr>
+        <w:t xml:space="preserve">Atividades: </w:t>
+      </w:r>
+    </w:p>
+    <w:p>
+      <w:pPr>
+        <w:spacing w:before="0" w:after="100" w:line="180" w:lineRule="exact"/>
+        <w:jc w:val="both"/>
+        <w:rPr>
+          <w:rFonts w:ascii="Arial" w:hAnsi="Arial" w:cs="Arial"/>
+          <w:b/>
+          <w:sz w:val="16"/>
+          <w:szCs w:val="16"/>
+        </w:rPr>
+      </w:pPr>
+      <w:r>
+        <w:rPr>
+          <w:rFonts w:ascii="Arial" w:hAnsi="Arial" w:cs="Arial"/>
+          <w:b/>
+          <w:sz w:val="16"/>
+          <w:szCs w:val="16"/>
+        </w:rPr>
+        <w:t xml:space="preserve">Objetivos a serem alcançados: - </w:t>
+      </w:r>
+      <w:r>
+        <w:rPr>
+          <w:rFonts w:ascii="Arial" w:hAnsi="Arial" w:cs="Arial"/>
+          <w:sz w:val="16"/>
+          <w:szCs w:val="16"/>
+        </w:rPr>
+        <w:t>Desenvolvimento do estagiário, envolvendo teoria e prática obtendo novos potenciais para o mercado de trabalho; propiciar atividade prática na área do curso, aplicando e ampliando o conhecimento acadêmico.</w:t>
+      </w:r>
+    </w:p>
+    <w:p>
+      <w:pPr>
+        <w:spacing w:before="0" w:after="100" w:line="180" w:lineRule="exact"/>
+        <w:jc w:val="both"/>
+        <w:rPr>
+          <w:rFonts w:ascii="Arial" w:hAnsi="Arial" w:cs="Arial"/>
+          <w:b/>
+          <w:bCs/>
+          <w:sz w:val="16"/>
+          <w:szCs w:val="16"/>
+        </w:rPr>
+      </w:pPr>
+      <w:r>
+        <w:rPr>
+          <w:rFonts w:ascii="Arial" w:hAnsi="Arial" w:cs="Arial"/>
+          <w:b/>
+          <w:bCs/>
+          <w:sz w:val="16"/>
+          <w:szCs w:val="16"/>
+        </w:rPr>
+        <w:t xml:space="preserve">Benefícios Obrigatórios: </w:t>
+      </w:r>
+      <w:r>
+        <w:rPr>
+          <w:rFonts w:ascii="Arial" w:hAnsi="Arial" w:cs="Arial"/>
+          <w:bCs/>
+          <w:sz w:val="16"/>
+          <w:szCs w:val="16"/>
+        </w:rPr>
+        <w:t xml:space="preserve">Auxílio transporte e recesso remunerado após </w:t>
+      </w:r>
+      <w:r>
+        <w:rPr>
+          <w:rFonts w:ascii="Arial" w:hAnsi="Arial" w:cs="Arial"/>
+          <w:bCs/>
+          <w:sz w:val="16"/>
+          <w:szCs w:val="16"/>
+        </w:rPr>
+        <w:t>0</w:t>
+      </w:r>
+      <w:r>
+        <w:rPr>
+          <w:rFonts w:ascii="Arial" w:hAnsi="Arial" w:cs="Arial"/>
+          <w:bCs/>
+          <w:sz w:val="16"/>
+          <w:szCs w:val="16"/>
+        </w:rPr>
+        <w:t xml:space="preserve">1 ano de estágio. Os dias de recesso previstos neste artigo serão concedidos de maneira proporcional, nos casos de o estágio ter duração inferior a </w:t>
+      </w:r>
+      <w:r>
+        <w:rPr>
+          <w:rFonts w:ascii="Arial" w:hAnsi="Arial" w:cs="Arial"/>
+          <w:bCs/>
+          <w:sz w:val="16"/>
+          <w:szCs w:val="16"/>
+        </w:rPr>
+        <w:t>0</w:t>
+      </w:r>
+      <w:r>
+        <w:rPr>
+          <w:rFonts w:ascii="Arial" w:hAnsi="Arial" w:cs="Arial"/>
+          <w:bCs/>
+          <w:sz w:val="16"/>
+          <w:szCs w:val="16"/>
+        </w:rPr>
+        <w:t>1 (um) ano.</w:t>
+      </w:r>
+    </w:p>
+    <w:p>
+      <w:pPr>
+        <w:spacing w:before="0" w:after="100" w:line="180" w:lineRule="exact"/>
+        <w:jc w:val="both"/>
+        <w:rPr>
+          <w:rFonts w:ascii="Arial" w:hAnsi="Arial" w:cs="Arial"/>
+          <w:b/>
+          <w:sz w:val="16"/>
+          <w:szCs w:val="16"/>
+        </w:rPr>
+      </w:pPr>
+      <w:r>
+        <w:rPr>
+          <w:rFonts w:ascii="Arial" w:hAnsi="Arial" w:cs="Arial"/>
+          <w:b/>
+          <w:sz w:val="16"/>
+          <w:szCs w:val="16"/>
+        </w:rPr>
+        <w:t xml:space="preserve">Benefícios Oferecidos pela concedente: </w:t>
+      </w:r>
+    </w:p>
+    <w:p>
+      <w:pPr>
+        <w:spacing w:before="0" w:after="100" w:line="180" w:lineRule="exact"/>
+        <w:jc w:val="both"/>
+        <w:rPr>
+          <w:rFonts w:ascii="Arial" w:hAnsi="Arial" w:cs="Arial"/>
+          <w:sz w:val="16"/>
+          <w:szCs w:val="16"/>
+        </w:rPr>
+      </w:pPr>
+      <w:r>
+        <w:rPr>
+          <w:rFonts w:ascii="Arial" w:hAnsi="Arial" w:cs="Arial"/>
+          <w:b/>
+          <w:sz w:val="16"/>
+          <w:szCs w:val="16"/>
+        </w:rPr>
+        <w:t>Valor da Bolsa de Estágio:</w:t>
+      </w:r>
+      <w:r>
+        <w:rPr>
+          <w:rFonts w:ascii="Arial" w:hAnsi="Arial" w:cs="Arial"/>
+          <w:sz w:val="16"/>
+          <w:szCs w:val="16"/>
+        </w:rPr>
+        <w:t xml:space="preserve"> R$</w:t>
+      </w:r>
+      <w:r>
+        <w:rPr>
+          <w:rFonts w:ascii="Arial" w:hAnsi="Arial" w:cs="Arial"/>
+          <w:sz w:val="16"/>
+          <w:szCs w:val="16"/>
+        </w:rPr>
+        <w:t xml:space="preserve"> {bolsa_valor}</w:t>
+      </w:r>
+    </w:p>
+    <w:p>
+      <w:pPr>
+        <w:spacing w:before="0" w:after="100" w:line="180" w:lineRule="exact"/>
+        <w:jc w:val="both"/>
+        <w:rPr>
+          <w:rFonts w:ascii="Arial" w:hAnsi="Arial" w:cs="Arial"/>
+          <w:sz w:val="16"/>
+          <w:szCs w:val="16"/>
+        </w:rPr>
+      </w:pPr>
+      <w:r>
+        <w:rPr>
+          <w:rFonts w:ascii="Arial" w:hAnsi="Arial" w:cs="Arial"/>
+          <w:b/>
+          <w:sz w:val="16"/>
+          <w:szCs w:val="16"/>
+        </w:rPr>
+        <w:t xml:space="preserve">Cia. de Seguros: </w:t>
+      </w:r>
+      <w:r>
+        <w:rPr>
+          <w:rFonts w:ascii="Arial" w:hAnsi="Arial" w:cs="Arial"/>
+          <w:b/>
+          <w:sz w:val="16"/>
+          <w:szCs w:val="16"/>
+        </w:rPr>
+        <w:t>PASI SERVIÇOS E BENEFÍCIOS S/A - CNPJ: 58.086.880/0001-40</w:t>
+      </w:r>
+      <w:r>
+        <w:rPr>
+          <w:rFonts w:ascii="Arial" w:hAnsi="Arial" w:cs="Arial"/>
+          <w:sz w:val="16"/>
+          <w:szCs w:val="16"/>
+        </w:rPr>
+        <w:t xml:space="preserve"> {seguro_spacer}</w:t>
+      </w:r>
+    </w:p>
+    <w:p>
+      <w:pPr>
+        <w:spacing w:before="0" w:after="100" w:line="180" w:lineRule="exact"/>
+        <w:jc w:val="both"/>
+        <w:rPr>
+          <w:rFonts w:ascii="Arial" w:hAnsi="Arial" w:cs="Arial"/>
+          <w:sz w:val="16"/>
+          <w:szCs w:val="16"/>
+        </w:rPr>
+      </w:pPr>
+      <w:r>
+        <w:rPr>
+          <w:rFonts w:ascii="Arial" w:hAnsi="Arial" w:cs="Arial"/>
+          <w:b/>
+          <w:sz w:val="16"/>
+          <w:szCs w:val="16"/>
+        </w:rPr>
+        <w:t>Apólice</w:t>
+      </w:r>
+      <w:r>
+        <w:rPr>
+          <w:rFonts w:ascii="Arial" w:hAnsi="Arial" w:cs="Arial"/>
+          <w:b/>
+          <w:sz w:val="16"/>
+          <w:szCs w:val="16"/>
+        </w:rPr>
+        <w:t>:</w:t>
+      </w:r>
+      <w:r>
+        <w:rPr>
+          <w:rFonts w:ascii="Arial" w:hAnsi="Arial" w:cs="Arial"/>
+          <w:b/>
+          <w:sz w:val="16"/>
+          <w:szCs w:val="16"/>
+        </w:rPr>
+        <w:t xml:space="preserve"> {apolice_numero}</w:t>
+      </w:r>
+      <w:r>
+        <w:rPr>
+          <w:rFonts w:ascii="Arial" w:hAnsi="Arial" w:cs="Arial"/>
+          <w:b/>
+          <w:sz w:val="16"/>
+          <w:szCs w:val="16"/>
+        </w:rPr>
+        <w:t>93768002</w:t>
+      </w:r>
+    </w:p>
+    <w:p>
+      <w:pPr>
+        <w:spacing w:before="0" w:after="100" w:line="180" w:lineRule="exact"/>
+        <w:jc w:val="both"/>
+        <w:rPr>
+          <w:rFonts w:ascii="Arial" w:hAnsi="Arial" w:cs="Arial"/>
+          <w:b/>
+          <w:sz w:val="16"/>
+          <w:szCs w:val="16"/>
+        </w:rPr>
+      </w:pPr>
+      <w:r>
+        <w:rPr>
+          <w:rFonts w:ascii="Arial" w:hAnsi="Arial" w:cs="Arial"/>
+          <w:b/>
+          <w:sz w:val="16"/>
+          <w:szCs w:val="16"/>
+        </w:rPr>
+        <w:t>(Cobertura e Importância Assegurada de R$ 10.000,00– Morte Acidental /Invalidez Permanente Por Acidente)</w:t>
+      </w:r>
+    </w:p>
+    <w:p>
+      <w:pPr>
         <w:spacing w:before="0" w:after="0" w:line="180" w:lineRule="exact"/>
-        <w:rPr>
-          <w:rFonts w:ascii="Arial" w:hAnsi="Arial" w:cs="Arial"/>
-          <w:b/>
-          <w:sz w:val="16"/>
-          <w:szCs w:val="16"/>
-        </w:rPr>
-      </w:pPr>
-      <w:r>
-        <w:rPr>
-          <w:rFonts w:ascii="Arial" w:hAnsi="Arial" w:cs="Arial"/>
-          <w:b/>
-          <w:sz w:val="16"/>
-          <w:szCs w:val="16"/>
-        </w:rPr>
-        <w:t>Período de realização de estágio</w:t>
-      </w:r>
-      <w:r>
-        <w:rPr>
-          <w:rFonts w:ascii="Arial" w:hAnsi="Arial" w:cs="Arial"/>
-          <w:b/>
-          <w:sz w:val="16"/>
-          <w:szCs w:val="16"/>
-        </w:rPr>
-        <w:t>:</w:t>
-      </w:r>
-      <w:r>
-        <w:rPr>
-          <w:rFonts w:ascii="Arial" w:hAnsi="Arial" w:cs="Arial"/>
-          <w:b/>
-          <w:sz w:val="16"/>
-          <w:szCs w:val="16"/>
-        </w:rPr>
-        <w:t xml:space="preserve"> {estagio_periodo}</w:t>
+        <w:jc w:val="both"/>
+        <w:rPr>
+          <w:rFonts w:ascii="Arial" w:hAnsi="Arial" w:cs="Arial"/>
+          <w:b/>
+          <w:sz w:val="16"/>
+          <w:szCs w:val="16"/>
+        </w:rPr>
+      </w:pPr>
+      <w:r>
+        <w:rPr>
+          <w:rFonts w:ascii="Arial" w:hAnsi="Arial" w:cs="Arial"/>
+          <w:b/>
+          <w:sz w:val="16"/>
+          <w:szCs w:val="16"/>
+        </w:rPr>
+        <w:t>Supervisor de Estágio</w:t>
       </w:r>
     </w:p>
     <w:p>
       <w:pPr>
         <w:spacing w:before="0" w:after="0" w:line="180" w:lineRule="exact"/>
-        <w:rPr>
-          <w:rFonts w:ascii="Arial" w:hAnsi="Arial" w:cs="Arial"/>
-          <w:b/>
-          <w:sz w:val="16"/>
-          <w:szCs w:val="16"/>
-        </w:rPr>
-      </w:pPr>
-      <w:r>
-        <w:rPr>
-          <w:rFonts w:ascii="Arial" w:hAnsi="Arial" w:cs="Arial"/>
-          <w:b/>
-          <w:sz w:val="16"/>
-          <w:szCs w:val="16"/>
-        </w:rPr>
-        <w:t>Horário de Estágio</w:t>
-      </w:r>
-      <w:r>
-        <w:rPr>
-          <w:rFonts w:ascii="Arial" w:hAnsi="Arial" w:cs="Arial"/>
-          <w:b/>
-          <w:sz w:val="16"/>
-          <w:szCs w:val="16"/>
-        </w:rPr>
-        <w:t>:</w:t>
-      </w:r>
-      <w:r w:rsidR="00HOR01">
-        <w:rPr>
-          <w:rFonts w:ascii="Arial" w:hAnsi="Arial" w:cs="Arial"/>
-          <w:b/>
-          <w:sz w:val="16"/>
-          <w:szCs w:val="16"/>
-        </w:rPr>
-        <w:t xml:space="preserve"> {est_horario_estagio}</w:t>
-      </w:r>
-    </w:p>
-    <w:p>
-      <w:pPr>
-        <w:spacing w:before="0" w:after="0" w:line="180" w:lineRule="exact"/>
-        <w:rPr>
-          <w:rFonts w:ascii="Arial" w:hAnsi="Arial" w:cs="Arial"/>
-          <w:b/>
-          <w:sz w:val="16"/>
-          <w:szCs w:val="16"/>
-        </w:rPr>
-      </w:pPr>
-      <w:r>
-        <w:rPr>
-          <w:rFonts w:ascii="Arial" w:hAnsi="Arial" w:cs="Arial"/>
-          <w:b/>
-          <w:sz w:val="16"/>
-          <w:szCs w:val="16"/>
-        </w:rPr>
-        <w:t>Total semanal:</w:t>
-      </w:r>
-      <w:r>
-        <w:rPr>
-          <w:rFonts w:ascii="Arial" w:hAnsi="Arial" w:cs="Arial"/>
-          <w:b/>
-          <w:sz w:val="16"/>
-          <w:szCs w:val="16"/>
-        </w:rPr>
-        <w:t xml:space="preserve"> 30 horas </w:t>
-      </w:r>
-    </w:p>
-    <w:p>
-      <w:pPr>
-        <w:spacing w:before="0" w:after="0" w:line="180" w:lineRule="exact"/>
-        <w:rPr>
-          <w:rFonts w:ascii="Arial" w:hAnsi="Arial" w:cs="Arial"/>
-          <w:b/>
-          <w:sz w:val="16"/>
-          <w:szCs w:val="16"/>
-        </w:rPr>
-      </w:pPr>
-      <w:r>
-        <w:rPr>
-          <w:rFonts w:ascii="Arial" w:hAnsi="Arial" w:cs="Arial"/>
-          <w:b/>
-          <w:sz w:val="16"/>
-          <w:szCs w:val="16"/>
-        </w:rPr>
-        <w:t>Atividades:</w:t>
-      </w:r>
-      <w:r w:rsidR="00ATV01">
-        <w:rPr>
-          <w:rFonts w:ascii="Arial" w:hAnsi="Arial" w:cs="Arial"/>
-          <w:b/>
-          <w:sz w:val="16"/>
-          <w:szCs w:val="16"/>
-        </w:rPr>
-        <w:t xml:space="preserve"> {est_atividades}</w:t>
-      </w:r>
-    </w:p>
-    <w:p>
-      <w:pPr>
-        <w:spacing w:before="0" w:after="0" w:line="180" w:lineRule="exact"/>
-        <w:jc w:val="both"/>
-        <w:rPr>
-          <w:rFonts w:ascii="Arial" w:hAnsi="Arial" w:cs="Arial"/>
-          <w:b/>
-          <w:sz w:val="16"/>
-          <w:szCs w:val="16"/>
-        </w:rPr>
-      </w:pPr>
-      <w:r>
-        <w:rPr>
-          <w:rFonts w:ascii="Arial" w:hAnsi="Arial" w:cs="Arial"/>
-          <w:b/>
-          <w:sz w:val="16"/>
-          <w:szCs w:val="16"/>
-        </w:rPr>
-        <w:t xml:space="preserve">Objetivos a serem alcançados: - </w:t>
-      </w:r>
-      <w:r>
-        <w:rPr>
-          <w:rFonts w:ascii="Arial" w:hAnsi="Arial" w:cs="Arial"/>
-          <w:sz w:val="16"/>
-          <w:szCs w:val="16"/>
-        </w:rPr>
-        <w:t>Desenvolvimento do estagiário, envolvendo teoria e prática obtendo novos potenciais para o mercado de trabalho; propiciar atividade prática na área do curso, aplicando e ampliando o conhecimento acadêmico.</w:t>
-      </w:r>
-    </w:p>
-    <w:p>
-      <w:pPr>
-        <w:spacing w:before="0" w:after="0" w:line="180" w:lineRule="exact"/>
-        <w:jc w:val="both"/>
-        <w:rPr>
-          <w:rFonts w:ascii="Arial" w:hAnsi="Arial" w:cs="Arial"/>
-          <w:b/>
-          <w:bCs/>
-          <w:sz w:val="16"/>
-          <w:szCs w:val="16"/>
-        </w:rPr>
-      </w:pPr>
-      <w:r>
-        <w:rPr>
-          <w:rFonts w:ascii="Arial" w:hAnsi="Arial" w:cs="Arial"/>
-          <w:b/>
-          <w:bCs/>
-          <w:sz w:val="16"/>
-          <w:szCs w:val="16"/>
-        </w:rPr>
-        <w:t xml:space="preserve">Benefícios Obrigatórios: </w:t>
-      </w:r>
-      <w:r>
-        <w:rPr>
-          <w:rFonts w:ascii="Arial" w:hAnsi="Arial" w:cs="Arial"/>
-          <w:bCs/>
-          <w:sz w:val="16"/>
-          <w:szCs w:val="16"/>
-        </w:rPr>
-        <w:t xml:space="preserve">Auxílio transporte e recesso remunerado após </w:t>
-      </w:r>
-      <w:r>
-        <w:rPr>
-          <w:rFonts w:ascii="Arial" w:hAnsi="Arial" w:cs="Arial"/>
-          <w:bCs/>
-          <w:sz w:val="16"/>
-          <w:szCs w:val="16"/>
-        </w:rPr>
-        <w:t>0</w:t>
-      </w:r>
-      <w:r>
-        <w:rPr>
-          <w:rFonts w:ascii="Arial" w:hAnsi="Arial" w:cs="Arial"/>
-          <w:bCs/>
-          <w:sz w:val="16"/>
-          <w:szCs w:val="16"/>
-        </w:rPr>
-        <w:t xml:space="preserve">1 ano de estágio. Os dias de recesso previstos neste artigo serão concedidos de maneira proporcional, nos casos de o estágio ter duração inferior a </w:t>
-      </w:r>
-      <w:r>
-        <w:rPr>
-          <w:rFonts w:ascii="Arial" w:hAnsi="Arial" w:cs="Arial"/>
-          <w:bCs/>
-          <w:sz w:val="16"/>
-          <w:szCs w:val="16"/>
-        </w:rPr>
-        <w:t>0</w:t>
-      </w:r>
-      <w:r>
-        <w:rPr>
-          <w:rFonts w:ascii="Arial" w:hAnsi="Arial" w:cs="Arial"/>
-          <w:bCs/>
-          <w:sz w:val="16"/>
-          <w:szCs w:val="16"/>
-        </w:rPr>
-        <w:t>1 (um) ano.</w:t>
-      </w:r>
-    </w:p>
-    <w:p>
-      <w:pPr>
-        <w:spacing w:before="0" w:after="0" w:line="180" w:lineRule="exact"/>
-        <w:jc w:val="both"/>
-        <w:rPr>
-          <w:rFonts w:ascii="Arial" w:hAnsi="Arial" w:cs="Arial"/>
-          <w:b/>
-          <w:sz w:val="16"/>
-          <w:szCs w:val="16"/>
-        </w:rPr>
-      </w:pPr>
-      <w:r>
-        <w:rPr>
-          <w:rFonts w:ascii="Arial" w:hAnsi="Arial" w:cs="Arial"/>
-          <w:b/>
-          <w:sz w:val="16"/>
-          <w:szCs w:val="16"/>
-        </w:rPr>
-        <w:t xml:space="preserve">Benefícios Oferecidos pela concedente: </w:t>
-      </w:r>
-    </w:p>
-    <w:p>
-      <w:pPr>
-        <w:spacing w:before="0" w:after="0" w:line="180" w:lineRule="exact"/>
-        <w:jc w:val="both"/>
-        <w:rPr>
-          <w:rFonts w:ascii="Arial" w:hAnsi="Arial" w:cs="Arial"/>
-          <w:sz w:val="16"/>
-          <w:szCs w:val="16"/>
-        </w:rPr>
-      </w:pPr>
-      <w:r>
-        <w:rPr>
-          <w:rFonts w:ascii="Arial" w:hAnsi="Arial" w:cs="Arial"/>
-          <w:b/>
-          <w:sz w:val="16"/>
-          <w:szCs w:val="16"/>
-        </w:rPr>
-        <w:t>Valor da Bolsa de Estágio:</w:t>
-      </w:r>
-      <w:r>
-        <w:rPr>
-          <w:rFonts w:ascii="Arial" w:hAnsi="Arial" w:cs="Arial"/>
-          <w:sz w:val="16"/>
-          <w:szCs w:val="16"/>
-        </w:rPr>
-        <w:t xml:space="preserve"> R$</w:t>
-      </w:r>
-      <w:r>
-        <w:rPr>
-          <w:rFonts w:ascii="Arial" w:hAnsi="Arial" w:cs="Arial"/>
-          <w:sz w:val="16"/>
-          <w:szCs w:val="16"/>
-        </w:rPr>
-        <w:t xml:space="preserve"> {bolsa_valor}</w:t>
-      </w:r>
-    </w:p>
-    <w:p>
-      <w:pPr>
-        <w:spacing w:before="0" w:after="0" w:line="180" w:lineRule="exact"/>
-        <w:jc w:val="both"/>
-        <w:rPr>
-          <w:rFonts w:ascii="Arial" w:hAnsi="Arial" w:cs="Arial"/>
-          <w:sz w:val="16"/>
-          <w:szCs w:val="16"/>
-        </w:rPr>
-      </w:pPr>
-      <w:r>
-        <w:rPr>
-          <w:rFonts w:ascii="Arial" w:hAnsi="Arial" w:cs="Arial"/>
-          <w:b/>
-          <w:sz w:val="16"/>
-          <w:szCs w:val="16"/>
-        </w:rPr>
-        <w:t xml:space="preserve">Cia. de Seguros: </w:t>
-      </w:r>
-      <w:r>
-        <w:rPr>
-          <w:rFonts w:ascii="Arial" w:hAnsi="Arial" w:cs="Arial"/>
-          <w:b/>
-          <w:sz w:val="16"/>
-          <w:szCs w:val="16"/>
-        </w:rPr>
-        <w:t>PASI SERVIÇOS E BENEFÍCIOS S/A - CNPJ: 58.086.880/0001-40</w:t>
-      </w:r>
-      <w:r>
-        <w:rPr>
-          <w:rFonts w:ascii="Arial" w:hAnsi="Arial" w:cs="Arial"/>
-          <w:sz w:val="16"/>
-          <w:szCs w:val="16"/>
-        </w:rPr>
-        <w:t xml:space="preserve"> {seguro_spacer}</w:t>
-      </w:r>
-    </w:p>
-    <w:p>
-      <w:pPr>
-        <w:spacing w:before="0" w:after="0" w:line="180" w:lineRule="exact"/>
-        <w:jc w:val="both"/>
-        <w:rPr>
-          <w:rFonts w:ascii="Arial" w:hAnsi="Arial" w:cs="Arial"/>
-          <w:sz w:val="16"/>
-          <w:szCs w:val="16"/>
-        </w:rPr>
-      </w:pPr>
-      <w:r>
-        <w:rPr>
-          <w:rFonts w:ascii="Arial" w:hAnsi="Arial" w:cs="Arial"/>
-          <w:b/>
-          <w:sz w:val="16"/>
-          <w:szCs w:val="16"/>
-        </w:rPr>
-        <w:t>Apólice</w:t>
-      </w:r>
-      <w:r>
-        <w:rPr>
-          <w:rFonts w:ascii="Arial" w:hAnsi="Arial" w:cs="Arial"/>
-          <w:b/>
-          <w:sz w:val="16"/>
-          <w:szCs w:val="16"/>
-        </w:rPr>
-        <w:t>:</w:t>
-      </w:r>
-      <w:r>
-        <w:rPr>
-          <w:rFonts w:ascii="Arial" w:hAnsi="Arial" w:cs="Arial"/>
-          <w:b/>
-          <w:sz w:val="16"/>
-          <w:szCs w:val="16"/>
-        </w:rPr>
-        <w:t xml:space="preserve"> {apolice_numero}</w:t>
-      </w:r>
-      <w:r>
-        <w:rPr>
-          <w:rFonts w:ascii="Arial" w:hAnsi="Arial" w:cs="Arial"/>
-          <w:b/>
-          <w:sz w:val="16"/>
-          <w:szCs w:val="16"/>
-        </w:rPr>
-        <w:t>93768002</w:t>
-      </w:r>
-    </w:p>
-    <w:p>
-      <w:pPr>
-        <w:spacing w:before="0" w:after="0" w:line="180" w:lineRule="exact"/>
-        <w:jc w:val="both"/>
-        <w:rPr>
-          <w:rFonts w:ascii="Arial" w:hAnsi="Arial" w:cs="Arial"/>
-          <w:b/>
-          <w:sz w:val="16"/>
-          <w:szCs w:val="16"/>
-        </w:rPr>
-      </w:pPr>
-      <w:r>
-        <w:rPr>
-          <w:rFonts w:ascii="Arial" w:hAnsi="Arial" w:cs="Arial"/>
-          <w:b/>
-          <w:sz w:val="16"/>
-          <w:szCs w:val="16"/>
-        </w:rPr>
-        <w:t>(Cobertura e Importância Assegurada de R$ 10.000,00– Morte Acidental /Invalidez Permanente Por Acidente)</w:t>
-      </w:r>
-    </w:p>
-    <w:p>
-      <w:pPr>
-        <w:spacing w:before="0" w:after="0" w:line="180" w:lineRule="exact"/>
-        <w:jc w:val="both"/>
-        <w:rPr>
-          <w:rFonts w:ascii="Arial" w:hAnsi="Arial" w:cs="Arial"/>
-          <w:b/>
-          <w:sz w:val="16"/>
-          <w:szCs w:val="16"/>
-        </w:rPr>
-      </w:pPr>
-      <w:r>
-        <w:rPr>
-          <w:rFonts w:ascii="Arial" w:hAnsi="Arial" w:cs="Arial"/>
-          <w:b/>
-          <w:sz w:val="16"/>
-          <w:szCs w:val="16"/>
-        </w:rPr>
-        <w:t>Supervisor de Estágio</w:t>
-      </w:r>
-    </w:p>
-    <w:p>
-      <w:pPr>
-        <w:spacing w:before="0" w:after="0" w:line="180" w:lineRule="exact"/>
         <w:jc w:val="both"/>
         <w:rPr>
           <w:rFonts w:ascii="Arial" w:hAnsi="Arial" w:cs="Arial"/>
@@ -2189,7 +2200,7 @@
     </w:p>
     <w:p>
       <w:pPr>
-        <w:spacing w:before="0" w:after="0" w:line="180" w:lineRule="exact"/>
+        <w:spacing w:before="0" w:after="100" w:line="180" w:lineRule="exact"/>
         <w:jc w:val="both"/>
         <w:rPr>
           <w:rFonts w:ascii="Arial" w:hAnsi="Arial" w:cs="Arial"/>
@@ -3737,6 +3748,26 @@
               <w:t>___________________________________________________</w:t>
             </w:r>
           </w:p>
+          <w:p w14:paraId="77IEIMG01">
+            <w:pPr>
+              <w:pStyle w:val="Corpodetexto"/>
+              <w:jc w:val="center"/>
+              <w:rPr>
+                <w:rFonts w:ascii="Arial" w:hAnsi="Arial" w:cs="Arial"/>
+                <w:b/>
+                <w:sz w:val="16"/>
+                <w:szCs w:val="16"/>
+              </w:rPr>
+            </w:pPr>
+            <w:r>
+              <w:rPr>
+                <w:rFonts w:ascii="Arial" w:hAnsi="Arial" w:cs="Arial"/>
+                <w:sz w:val="16"/>
+                <w:szCs w:val="16"/>
+              </w:rPr>
+              <w:t>{%ie_assinatura}</w:t>
+            </w:r>
+          </w:p>
           <w:p>
             <w:pPr>
               <w:pStyle w:val="Corpodetexto"/>
@@ -3769,14 +3800,6 @@
                 <w:szCs w:val="16"/>
               </w:rPr>
             </w:pPr>
-            <w:r>
-              <w:rPr>
-                <w:rFonts w:ascii="Arial" w:hAnsi="Arial" w:cs="Arial"/>
-                <w:sz w:val="16"/>
-                <w:szCs w:val="16"/>
-              </w:rPr>
-              <w:t>%%ie_assinatura</w:t>
-            </w:r>
           </w:p>
           <w:p>
             <w:pPr>
@@ -4137,15 +4160,6 @@
       </w:tr>
     </w:tbl>
     <w:p>
-      <w:pPr>
-        <w:pStyle w:val="Corpodetexto"/>
-        <w:rPr>
-          <w:rFonts w:ascii="Arial" w:hAnsi="Arial" w:cs="Arial"/>
-          <w:b/>
-          <w:sz w:val="16"/>
-          <w:szCs w:val="16"/>
-        </w:rPr>
-      </w:pPr>
       <w:r>
         <w:rPr>
           <w:rFonts w:ascii="Arial" w:hAnsi="Arial" w:cs="Arial"/>
@@ -4162,79 +4176,7 @@
           <w:sz w:val="16"/>
           <w:szCs w:val="16"/>
         </w:rPr>
-        <w:t xml:space="preserve">, </w:t>
-      </w:r>
-      <w:r>
-        <w:rPr>
-          <w:rFonts w:ascii="Arial" w:hAnsi="Arial" w:cs="Arial"/>
-          <w:b/>
-          <w:sz w:val="16"/>
-          <w:szCs w:val="16"/>
-        </w:rPr>
-        <w:t>______</w:t>
-      </w:r>
-      <w:r>
-        <w:rPr>
-          <w:rFonts w:ascii="Arial" w:hAnsi="Arial" w:cs="Arial"/>
-          <w:b/>
-          <w:sz w:val="16"/>
-          <w:szCs w:val="16"/>
-        </w:rPr>
-        <w:t xml:space="preserve"> de </w:t>
-      </w:r>
-      <w:r>
-        <w:rPr>
-          <w:rFonts w:ascii="Arial" w:hAnsi="Arial" w:cs="Arial"/>
-          <w:b/>
-          <w:sz w:val="16"/>
-          <w:szCs w:val="16"/>
-        </w:rPr>
-        <w:t>_______________</w:t>
-      </w:r>
-      <w:r>
-        <w:rPr>
-          <w:rFonts w:ascii="Arial" w:hAnsi="Arial" w:cs="Arial"/>
-          <w:b/>
-          <w:sz w:val="16"/>
-          <w:szCs w:val="16"/>
-        </w:rPr>
-        <w:t xml:space="preserve"> {data_assinatura}</w:t>
-      </w:r>
-      <w:r>
-        <w:rPr>
-          <w:rFonts w:ascii="Arial" w:hAnsi="Arial" w:cs="Arial"/>
-          <w:b/>
-          <w:sz w:val="16"/>
-          <w:szCs w:val="16"/>
-        </w:rPr>
-        <w:t>_</w:t>
-      </w:r>
-      <w:r>
-        <w:rPr>
-          <w:rFonts w:ascii="Arial" w:hAnsi="Arial" w:cs="Arial"/>
-          <w:b/>
-          <w:sz w:val="16"/>
-          <w:szCs w:val="16"/>
-        </w:rPr>
-        <w:t xml:space="preserve">de </w:t>
-      </w:r>
-      <w:r>
-        <w:rPr>
-          <w:rFonts w:ascii="Arial" w:hAnsi="Arial" w:cs="Arial"/>
-          <w:b/>
-          <w:sz w:val="16"/>
-          <w:szCs w:val="16"/>
-        </w:rPr>
-        <w:t>___________</w:t>
-      </w:r>
-      <w:r>
-        <w:rPr>
-          <w:rFonts w:ascii="Arial" w:hAnsi="Arial" w:cs="Arial"/>
-          <w:b/>
-          <w:sz w:val="16"/>
-          <w:szCs w:val="16"/>
-        </w:rPr>
-        <w:t>.</w:t>
+        <w:t xml:space="preserve">, ______ de ______ de ______</w:t>
       </w:r>
     </w:p>
     <w:sectPr>

</xml_diff>

<commit_message>
Atualiza template TCE DOCX, script de build e tceDocxService.
Made-with: Cursor
</commit_message>
<xml_diff>
--- a/public/templates/tce.docx
+++ b/public/templates/tce.docx
@@ -677,7 +677,7 @@
           <w:sz w:val="16"/>
           <w:szCs w:val="16"/>
         </w:rPr>
-        <w:t xml:space="preserve">Telefone: </w:t>
+        <w:t xml:space="preserve">Telefone: {empresa_telefone}</w:t>
       </w:r>
     </w:p>
     <w:p>
@@ -743,7 +743,7 @@
           <w:sz w:val="16"/>
           <w:szCs w:val="16"/>
         </w:rPr>
-        <w:t xml:space="preserve">Cargo: </w:t>
+        <w:t xml:space="preserve">Cargo: {empresa_cargo}</w:t>
       </w:r>
     </w:p>
     <w:p>
@@ -802,7 +802,7 @@
           <w:sz w:val="16"/>
           <w:szCs w:val="16"/>
         </w:rPr>
-        <w:t xml:space="preserve">                                                                                                                     CNPJ: {ie_cnpj} </w:t>
+        <w:t xml:space="preserve">                                                                                                                     CNPJ: {ie_cnpj} </w:t>
       </w:r>
     </w:p>
     <w:p>
@@ -917,16 +917,7 @@
           <w:sz w:val="16"/>
           <w:szCs w:val="16"/>
         </w:rPr>
-        <w:t xml:space="preserve"> CEP:</w:t>
-      </w:r>
-      <w:r>
-        <w:rPr>
-          <w:rFonts w:ascii="Arial" w:hAnsi="Arial" w:cs="Arial"/>
-          <w:b/>
-          <w:sz w:val="16"/>
-          <w:szCs w:val="16"/>
-        </w:rPr>
-        <w:t xml:space="preserve"> {ie_cep}</w:t>
+        <w:t xml:space="preserve"> CEP: {ie_cep}</w:t>
       </w:r>
       <w:r>
         <w:rPr>
@@ -1085,7 +1076,7 @@
           <w:sz w:val="16"/>
           <w:szCs w:val="16"/>
         </w:rPr>
-        <w:t xml:space="preserve"> {est_row_spacer_18}</w:t>
+        <w:t xml:space="preserve"> {est_cpf}</w:t>
       </w:r>
       <w:r>
         <w:rPr>
@@ -1181,15 +1172,7 @@
           <w:sz w:val="16"/>
           <w:szCs w:val="16"/>
         </w:rPr>
-        <w:t>Nacionalidade</w:t>
-      </w:r>
-      <w:r>
-        <w:rPr>
-          <w:rFonts w:ascii="Arial" w:hAnsi="Arial" w:cs="Arial"/>
-          <w:sz w:val="16"/>
-          <w:szCs w:val="16"/>
-        </w:rPr>
-        <w:t xml:space="preserve">:  </w:t>
+        <w:t xml:space="preserve">Nacionalidade: Brasileira</w:t>
       </w:r>
     </w:p>
     <w:p>
@@ -1342,7 +1325,7 @@
           <w:sz w:val="16"/>
           <w:szCs w:val="16"/>
         </w:rPr>
-        <w:t>RG</w:t>
+        <w:t>Telefone</w:t>
       </w:r>
       <w:r>
         <w:rPr>
@@ -1358,71 +1341,39 @@
           <w:sz w:val="16"/>
           <w:szCs w:val="16"/>
         </w:rPr>
-        <w:t xml:space="preserve"> {est_rg}</w:t>
-      </w:r>
-      <w:r>
-        <w:rPr>
-          <w:rFonts w:ascii="Arial" w:hAnsi="Arial" w:cs="Arial"/>
-          <w:sz w:val="16"/>
-          <w:szCs w:val="16"/>
-        </w:rPr>
-        <w:t xml:space="preserve">                 </w:t>
-      </w:r>
-      <w:r>
-        <w:rPr>
-          <w:rFonts w:ascii="Arial" w:hAnsi="Arial" w:cs="Arial"/>
-          <w:sz w:val="16"/>
-          <w:szCs w:val="16"/>
-        </w:rPr>
-        <w:t xml:space="preserve"> {est_rg_line_pad}</w:t>
-      </w:r>
-      <w:r>
-        <w:rPr>
-          <w:rFonts w:ascii="Arial" w:hAnsi="Arial" w:cs="Arial"/>
-          <w:sz w:val="16"/>
-          <w:szCs w:val="16"/>
-        </w:rPr>
-        <w:t xml:space="preserve">  </w:t>
-      </w:r>
-      <w:r>
-        <w:rPr>
-          <w:rFonts w:ascii="Arial" w:hAnsi="Arial" w:cs="Arial"/>
-          <w:sz w:val="16"/>
-          <w:szCs w:val="16"/>
-        </w:rPr>
-        <w:t xml:space="preserve"> {est_rg_spacer_23}</w:t>
-      </w:r>
-      <w:r>
-        <w:rPr>
-          <w:rFonts w:ascii="Arial" w:hAnsi="Arial" w:cs="Arial"/>
-          <w:sz w:val="16"/>
-          <w:szCs w:val="16"/>
-        </w:rPr>
-        <w:t xml:space="preserve"> {est_cidade_pad_a}</w:t>
-      </w:r>
-      <w:r>
-        <w:rPr>
-          <w:rFonts w:ascii="Arial" w:hAnsi="Arial" w:cs="Arial"/>
-          <w:sz w:val="16"/>
-          <w:szCs w:val="16"/>
-        </w:rPr>
-        <w:t xml:space="preserve"> {est_cpf_spacer_24}</w:t>
-      </w:r>
-      <w:r>
-        <w:rPr>
-          <w:rFonts w:ascii="Arial" w:hAnsi="Arial" w:cs="Arial"/>
-          <w:sz w:val="16"/>
-          <w:szCs w:val="16"/>
-        </w:rPr>
-        <w:t>CPF:</w:t>
-      </w:r>
-      <w:r>
-        <w:rPr>
-          <w:rFonts w:ascii="Arial" w:hAnsi="Arial" w:cs="Arial"/>
-          <w:sz w:val="16"/>
-          <w:szCs w:val="16"/>
-        </w:rPr>
-        <w:t xml:space="preserve"> {est_cpf}</w:t>
+        <w:t xml:space="preserve"> {resp_telefone_contrato}</w:t>
+      </w:r>
+      <w:r>
+        <w:rPr>
+          <w:rFonts w:ascii="Arial" w:hAnsi="Arial" w:cs="Arial"/>
+          <w:sz w:val="16"/>
+          <w:szCs w:val="16"/>
+        </w:rPr>
+        <w:t xml:space="preserve">                                  </w:t>
+      </w:r>
+      <w:r>
+        <w:rPr>
+          <w:rFonts w:ascii="Arial" w:hAnsi="Arial" w:cs="Arial"/>
+          <w:sz w:val="16"/>
+          <w:szCs w:val="16"/>
+        </w:rPr>
+        <w:t>CPF</w:t>
+      </w:r>
+      <w:r>
+        <w:rPr>
+          <w:rFonts w:ascii="Arial" w:hAnsi="Arial" w:cs="Arial"/>
+          <w:sz w:val="16"/>
+          <w:szCs w:val="16"/>
+        </w:rPr>
+        <w:t>:</w:t>
+      </w:r>
+      <w:r>
+        <w:rPr>
+          <w:rFonts w:ascii="Arial" w:hAnsi="Arial" w:cs="Arial"/>
+          <w:sz w:val="16"/>
+          <w:szCs w:val="16"/>
+        </w:rPr>
+        <w:t xml:space="preserve"> {resp_cpf_contrato}</w:t>
       </w:r>
     </w:p>
     <w:p>
@@ -1836,7 +1787,7 @@
           <w:sz w:val="16"/>
           <w:szCs w:val="16"/>
         </w:rPr>
-        <w:t xml:space="preserve">: </w:t>
+        <w:t xml:space="preserve">: {est_horario_estagio}</w:t>
       </w:r>
     </w:p>
     <w:p>
@@ -1885,7 +1836,7 @@
           <w:sz w:val="16"/>
           <w:szCs w:val="16"/>
         </w:rPr>
-        <w:t xml:space="preserve">Atividades: </w:t>
+        <w:t xml:space="preserve">Atividades: {est_atividades}</w:t>
       </w:r>
     </w:p>
     <w:p>

</xml_diff>